<commit_message>
Add appointments workflow and refactor clinical visit forms
</commit_message>
<xml_diff>
--- a/src/lib/templates/template_dislip.docx
+++ b/src/lib/templates/template_dislip.docx
@@ -510,6 +510,48 @@
         <w:rPr>
           <w:rFonts w:ascii="Arial" w:hAnsi="Arial" w:cs="Arial"/>
         </w:rPr>
+        <w:t>ipercol</w:t>
+      </w:r>
+      <w:proofErr w:type="spellEnd"/>
+      <w:r>
+        <w:rPr>
+          <w:rFonts w:ascii="Arial" w:hAnsi="Arial" w:cs="Arial"/>
+        </w:rPr>
+        <w:t>} {</w:t>
+      </w:r>
+      <w:proofErr w:type="spellStart"/>
+      <w:r>
+        <w:rPr>
+          <w:rFonts w:ascii="Arial" w:hAnsi="Arial" w:cs="Arial"/>
+        </w:rPr>
+        <w:t>ipercol_score</w:t>
+      </w:r>
+      <w:proofErr w:type="spellEnd"/>
+      <w:r>
+        <w:rPr>
+          <w:rFonts w:ascii="Arial" w:hAnsi="Arial" w:cs="Arial"/>
+        </w:rPr>
+        <w:t>}</w:t>
+      </w:r>
+    </w:p>
+    <w:p>
+      <w:pPr>
+        <w:spacing w:line="276" w:lineRule="auto"/>
+        <w:rPr>
+          <w:rFonts w:ascii="Arial" w:hAnsi="Arial" w:cs="Arial"/>
+        </w:rPr>
+      </w:pPr>
+      <w:r>
+        <w:rPr>
+          <w:rFonts w:ascii="Arial" w:hAnsi="Arial" w:cs="Arial"/>
+        </w:rPr>
+        <w:t>{</w:t>
+      </w:r>
+      <w:proofErr w:type="spellStart"/>
+      <w:r>
+        <w:rPr>
+          <w:rFonts w:ascii="Arial" w:hAnsi="Arial" w:cs="Arial"/>
+        </w:rPr>
         <w:t>hapr</w:t>
       </w:r>
       <w:proofErr w:type="spellEnd"/>
@@ -675,58 +717,90 @@
         </w:rPr>
         <w:t>Esami ematici</w:t>
       </w:r>
-    </w:p>
-    <w:p>
-      <w:pPr>
-        <w:spacing w:line="276" w:lineRule="auto"/>
-        <w:rPr>
-          <w:rFonts w:ascii="Arial" w:hAnsi="Arial" w:cs="Arial"/>
-        </w:rPr>
-      </w:pPr>
-      <w:r>
-        <w:rPr>
-          <w:rFonts w:ascii="Arial" w:hAnsi="Arial" w:cs="Arial"/>
-        </w:rPr>
-        <w:t>{</w:t>
-      </w:r>
-      <w:proofErr w:type="spellStart"/>
-      <w:r>
-        <w:rPr>
-          <w:rFonts w:ascii="Arial" w:hAnsi="Arial" w:cs="Arial"/>
-        </w:rPr>
-        <w:t>ee</w:t>
-      </w:r>
-      <w:proofErr w:type="spellEnd"/>
-      <w:r>
-        <w:rPr>
-          <w:rFonts w:ascii="Arial" w:hAnsi="Arial" w:cs="Arial"/>
-        </w:rPr>
-        <w:t>}</w:t>
-      </w:r>
-    </w:p>
-    <w:p>
-      <w:pPr>
-        <w:spacing w:line="276" w:lineRule="auto"/>
-        <w:rPr>
-          <w:rFonts w:ascii="Arial" w:hAnsi="Arial" w:cs="Arial"/>
-        </w:rPr>
-      </w:pPr>
-    </w:p>
-    <w:p>
-      <w:pPr>
-        <w:spacing w:line="276" w:lineRule="auto"/>
+      <w:r>
         <w:rPr>
           <w:rFonts w:ascii="Arial" w:hAnsi="Arial" w:cs="Arial"/>
           <w:b/>
           <w:bCs/>
         </w:rPr>
-      </w:pPr>
+        <w:t xml:space="preserve"> </w:t>
+      </w:r>
       <w:r>
         <w:rPr>
           <w:rFonts w:ascii="Arial" w:hAnsi="Arial" w:cs="Arial"/>
           <w:b/>
           <w:bCs/>
         </w:rPr>
+        <w:t>(</w:t>
+      </w:r>
+      <w:r>
+        <w:rPr>
+          <w:rFonts w:ascii="Arial" w:hAnsi="Arial" w:cs="Arial"/>
+          <w:b/>
+          <w:bCs/>
+        </w:rPr>
+        <w:t>{data_ee}</w:t>
+      </w:r>
+      <w:r>
+        <w:rPr>
+          <w:rFonts w:ascii="Arial" w:hAnsi="Arial" w:cs="Arial"/>
+          <w:b/>
+          <w:bCs/>
+        </w:rPr>
+        <w:t>)</w:t>
+      </w:r>
+    </w:p>
+    <w:p>
+      <w:pPr>
+        <w:spacing w:line="276" w:lineRule="auto"/>
+        <w:rPr>
+          <w:rFonts w:ascii="Arial" w:hAnsi="Arial" w:cs="Arial"/>
+        </w:rPr>
+      </w:pPr>
+      <w:r>
+        <w:rPr>
+          <w:rFonts w:ascii="Arial" w:hAnsi="Arial" w:cs="Arial"/>
+        </w:rPr>
+        <w:t>{</w:t>
+      </w:r>
+      <w:proofErr w:type="spellStart"/>
+      <w:r>
+        <w:rPr>
+          <w:rFonts w:ascii="Arial" w:hAnsi="Arial" w:cs="Arial"/>
+        </w:rPr>
+        <w:t>ee</w:t>
+      </w:r>
+      <w:proofErr w:type="spellEnd"/>
+      <w:r>
+        <w:rPr>
+          <w:rFonts w:ascii="Arial" w:hAnsi="Arial" w:cs="Arial"/>
+        </w:rPr>
+        <w:t>}</w:t>
+      </w:r>
+    </w:p>
+    <w:p>
+      <w:pPr>
+        <w:spacing w:line="276" w:lineRule="auto"/>
+        <w:rPr>
+          <w:rFonts w:ascii="Arial" w:hAnsi="Arial" w:cs="Arial"/>
+        </w:rPr>
+      </w:pPr>
+    </w:p>
+    <w:p>
+      <w:pPr>
+        <w:spacing w:line="276" w:lineRule="auto"/>
+        <w:rPr>
+          <w:rFonts w:ascii="Arial" w:hAnsi="Arial" w:cs="Arial"/>
+          <w:b/>
+          <w:bCs/>
+        </w:rPr>
+      </w:pPr>
+      <w:r>
+        <w:rPr>
+          <w:rFonts w:ascii="Arial" w:hAnsi="Arial" w:cs="Arial"/>
+          <w:b/>
+          <w:bCs/>
+        </w:rPr>
         <w:t>Valutazione del rischio cardiovascolare</w:t>
       </w:r>
     </w:p>
@@ -1021,19 +1095,7 @@
         <w:rPr>
           <w:rFonts w:ascii="Arial" w:hAnsi="Arial" w:cs="Arial"/>
         </w:rPr>
-        <w:t>{dottssa</w:t>
-      </w:r>
-      <w:r>
-        <w:rPr>
-          <w:rFonts w:ascii="Arial" w:hAnsi="Arial" w:cs="Arial"/>
-        </w:rPr>
-        <w:t>sp1</w:t>
-      </w:r>
-      <w:r>
-        <w:rPr>
-          <w:rFonts w:ascii="Arial" w:hAnsi="Arial" w:cs="Arial"/>
-        </w:rPr>
-        <w:t xml:space="preserve">} </w:t>
+        <w:t xml:space="preserve">{dottssasp1} </w:t>
       </w:r>
       <w:r>
         <w:rPr>
@@ -1065,31 +1127,7 @@
         <w:rPr>
           <w:rFonts w:ascii="Arial" w:hAnsi="Arial" w:cs="Arial"/>
         </w:rPr>
-        <w:t>{dottssa</w:t>
-      </w:r>
-      <w:r>
-        <w:rPr>
-          <w:rFonts w:ascii="Arial" w:hAnsi="Arial" w:cs="Arial"/>
-        </w:rPr>
-        <w:t>sp2</w:t>
-      </w:r>
-      <w:r>
-        <w:rPr>
-          <w:rFonts w:ascii="Arial" w:hAnsi="Arial" w:cs="Arial"/>
-        </w:rPr>
-        <w:t>} {specializzando</w:t>
-      </w:r>
-      <w:r>
-        <w:rPr>
-          <w:rFonts w:ascii="Arial" w:hAnsi="Arial" w:cs="Arial"/>
-        </w:rPr>
-        <w:t>2</w:t>
-      </w:r>
-      <w:r>
-        <w:rPr>
-          <w:rFonts w:ascii="Arial" w:hAnsi="Arial" w:cs="Arial"/>
-        </w:rPr>
-        <w:t>}</w:t>
+        <w:t>{dottssasp2} {specializzando2}</w:t>
       </w:r>
     </w:p>
     <w:p>
@@ -1103,40 +1141,8 @@
         <w:rPr>
           <w:rFonts w:ascii="Arial" w:hAnsi="Arial" w:cs="Arial"/>
         </w:rPr>
-        <w:t>{dottssa</w:t>
-      </w:r>
-      <w:r>
-        <w:rPr>
-          <w:rFonts w:ascii="Arial" w:hAnsi="Arial" w:cs="Arial"/>
-        </w:rPr>
-        <w:t>sp3</w:t>
-      </w:r>
-      <w:r>
-        <w:rPr>
-          <w:rFonts w:ascii="Arial" w:hAnsi="Arial" w:cs="Arial"/>
-        </w:rPr>
-        <w:t>} {specializzando</w:t>
-      </w:r>
-      <w:r>
-        <w:rPr>
-          <w:rFonts w:ascii="Arial" w:hAnsi="Arial" w:cs="Arial"/>
-        </w:rPr>
-        <w:t>3</w:t>
-      </w:r>
-      <w:r>
-        <w:rPr>
-          <w:rFonts w:ascii="Arial" w:hAnsi="Arial" w:cs="Arial"/>
-        </w:rPr>
-        <w:t>}</w:t>
-      </w:r>
-    </w:p>
-    <w:p>
-      <w:pPr>
-        <w:spacing w:line="276" w:lineRule="auto"/>
-        <w:rPr>
-          <w:rFonts w:ascii="Arial" w:hAnsi="Arial" w:cs="Arial"/>
-        </w:rPr>
-      </w:pPr>
+        <w:t>{dottssasp3} {specializzando3}</w:t>
+      </w:r>
     </w:p>
     <w:sectPr>
       <w:headerReference w:type="default" r:id="rId7"/>
@@ -1180,18 +1186,18 @@
         <w:noProof/>
       </w:rPr>
       <w:drawing>
-        <wp:anchor distT="0" distB="0" distL="114300" distR="114300" simplePos="0" relativeHeight="251669504" behindDoc="1" locked="0" layoutInCell="1" allowOverlap="1" wp14:anchorId="2BB6767A" wp14:editId="3CFAADFB">
+        <wp:anchor distT="0" distB="0" distL="114300" distR="114300" simplePos="0" relativeHeight="251673600" behindDoc="0" locked="0" layoutInCell="1" allowOverlap="1" wp14:anchorId="7DC32C0C" wp14:editId="055B271D">
           <wp:simplePos x="0" y="0"/>
           <wp:positionH relativeFrom="column">
-            <wp:posOffset>5779717</wp:posOffset>
+            <wp:posOffset>5820892</wp:posOffset>
           </wp:positionH>
           <wp:positionV relativeFrom="paragraph">
-            <wp:posOffset>342900</wp:posOffset>
+            <wp:posOffset>445464</wp:posOffset>
           </wp:positionV>
-          <wp:extent cx="512445" cy="512445"/>
-          <wp:effectExtent l="0" t="0" r="0" b="0"/>
+          <wp:extent cx="324000" cy="324000"/>
+          <wp:effectExtent l="0" t="0" r="6350" b="6350"/>
           <wp:wrapNone/>
-          <wp:docPr id="2028412918" name="Immagine 1"/>
+          <wp:docPr id="650469873" name="Immagine 1"/>
           <wp:cNvGraphicFramePr>
             <a:graphicFrameLocks xmlns:a="http://schemas.openxmlformats.org/drawingml/2006/main" noChangeAspect="1"/>
           </wp:cNvGraphicFramePr>
@@ -1199,7 +1205,7 @@
             <a:graphicData uri="http://schemas.openxmlformats.org/drawingml/2006/picture">
               <pic:pic xmlns:pic="http://schemas.openxmlformats.org/drawingml/2006/picture">
                 <pic:nvPicPr>
-                  <pic:cNvPr id="2028412918" name="Immagine 1"/>
+                  <pic:cNvPr id="650469873" name=""/>
                   <pic:cNvPicPr/>
                 </pic:nvPicPr>
                 <pic:blipFill>
@@ -1217,7 +1223,7 @@
                 <pic:spPr>
                   <a:xfrm>
                     <a:off x="0" y="0"/>
-                    <a:ext cx="512445" cy="512445"/>
+                    <a:ext cx="324000" cy="324000"/>
                   </a:xfrm>
                   <a:prstGeom prst="rect">
                     <a:avLst/>
@@ -1242,7 +1248,7 @@
       <mc:AlternateContent>
         <mc:Choice Requires="wps">
           <w:drawing>
-            <wp:anchor distT="0" distB="0" distL="114935" distR="114935" simplePos="0" relativeHeight="251657215" behindDoc="1" locked="0" layoutInCell="1" allowOverlap="1" wp14:anchorId="3C88F6DD" wp14:editId="5F719FD4">
+            <wp:anchor distT="0" distB="0" distL="114935" distR="114935" simplePos="0" relativeHeight="251657215" behindDoc="1" locked="0" layoutInCell="1" allowOverlap="1" wp14:anchorId="3C88F6DD" wp14:editId="0F887179">
               <wp:simplePos x="0" y="0"/>
               <wp:positionH relativeFrom="page">
                 <wp:posOffset>5524102</wp:posOffset>
@@ -1451,7 +1457,7 @@
               <v:stroke joinstyle="miter"/>
               <v:path gradientshapeok="t" o:connecttype="rect"/>
             </v:shapetype>
-            <v:shape id="Text Box 1" o:spid="_x0000_s1026" type="#_x0000_t202" style="position:absolute;margin-left:434.95pt;margin-top:762pt;width:99.1pt;height:60.45pt;z-index:-251659265;visibility:visible;mso-wrap-style:square;mso-width-percent:0;mso-height-percent:0;mso-wrap-distance-left:9.05pt;mso-wrap-distance-top:0;mso-wrap-distance-right:9.05pt;mso-wrap-distance-bottom:0;mso-position-horizontal:absolute;mso-position-horizontal-relative:page;mso-position-vertical:absolute;mso-position-vertical-relative:page;mso-width-percent:0;mso-height-percent:0;mso-width-relative:page;mso-height-relative:page;v-text-anchor:top" o:gfxdata="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" stroked="f">
+            <v:shape id="Text Box 1" o:spid="_x0000_s1027" type="#_x0000_t202" style="position:absolute;margin-left:434.95pt;margin-top:762pt;width:99.1pt;height:60.45pt;z-index:-251659265;visibility:visible;mso-wrap-style:square;mso-width-percent:0;mso-height-percent:0;mso-wrap-distance-left:9.05pt;mso-wrap-distance-top:0;mso-wrap-distance-right:9.05pt;mso-wrap-distance-bottom:0;mso-position-horizontal:absolute;mso-position-horizontal-relative:page;mso-position-vertical:absolute;mso-position-vertical-relative:page;mso-width-percent:0;mso-height-percent:0;mso-width-relative:page;mso-height-relative:page;v-text-anchor:top" o:gfxdata="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" stroked="f">
               <v:fill opacity="0"/>
               <v:path arrowok="t"/>
               <v:textbox inset=".1pt,.1pt,7.3pt,3.7pt">
@@ -1724,7 +1730,7 @@
         </mc:Choice>
         <mc:Fallback>
           <w:pict>
-            <v:shape w14:anchorId="10B21FFA" id="Text Box 2" o:spid="_x0000_s1027" type="#_x0000_t202" style="position:absolute;margin-left:242.2pt;margin-top:762pt;width:119.9pt;height:35.1pt;z-index:-251650048;visibility:visible;mso-wrap-style:square;mso-width-percent:0;mso-height-percent:0;mso-wrap-distance-left:9.05pt;mso-wrap-distance-top:0;mso-wrap-distance-right:9.05pt;mso-wrap-distance-bottom:0;mso-position-horizontal:absolute;mso-position-horizontal-relative:page;mso-position-vertical:absolute;mso-position-vertical-relative:page;mso-width-percent:0;mso-height-percent:0;mso-width-relative:page;mso-height-relative:page;v-text-anchor:top" o:gfxdata="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" stroked="f">
+            <v:shape w14:anchorId="10B21FFA" id="Text Box 2" o:spid="_x0000_s1028" type="#_x0000_t202" style="position:absolute;margin-left:242.2pt;margin-top:762pt;width:119.9pt;height:35.1pt;z-index:-251650048;visibility:visible;mso-wrap-style:square;mso-width-percent:0;mso-height-percent:0;mso-wrap-distance-left:9.05pt;mso-wrap-distance-top:0;mso-wrap-distance-right:9.05pt;mso-wrap-distance-bottom:0;mso-position-horizontal:absolute;mso-position-horizontal-relative:page;mso-position-vertical:absolute;mso-position-vertical-relative:page;mso-width-percent:0;mso-height-percent:0;mso-width-relative:page;mso-height-relative:page;v-text-anchor:top" o:gfxdata="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" stroked="f">
               <v:fill opacity="0"/>
               <v:path arrowok="t"/>
               <v:textbox inset=".1pt,.1pt,7.3pt,3.7pt">
@@ -1962,7 +1968,7 @@
         </mc:Choice>
         <mc:Fallback>
           <w:pict>
-            <v:shape w14:anchorId="21D034EE" id="Text Box 3" o:spid="_x0000_s1028" type="#_x0000_t202" style="position:absolute;margin-left:56.8pt;margin-top:762.3pt;width:130.15pt;height:50.85pt;z-index:-251652096;visibility:visible;mso-wrap-style:square;mso-width-percent:0;mso-height-percent:0;mso-wrap-distance-left:9.05pt;mso-wrap-distance-top:0;mso-wrap-distance-right:9.05pt;mso-wrap-distance-bottom:0;mso-position-horizontal:absolute;mso-position-horizontal-relative:page;mso-position-vertical:absolute;mso-position-vertical-relative:page;mso-width-percent:0;mso-height-percent:0;mso-width-relative:page;mso-height-relative:page;v-text-anchor:top" o:gfxdata="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" stroked="f">
+            <v:shape w14:anchorId="21D034EE" id="Text Box 3" o:spid="_x0000_s1029" type="#_x0000_t202" style="position:absolute;margin-left:56.8pt;margin-top:762.3pt;width:130.15pt;height:50.85pt;z-index:-251652096;visibility:visible;mso-wrap-style:square;mso-width-percent:0;mso-height-percent:0;mso-wrap-distance-left:9.05pt;mso-wrap-distance-top:0;mso-wrap-distance-right:9.05pt;mso-wrap-distance-bottom:0;mso-position-horizontal:absolute;mso-position-horizontal-relative:page;mso-position-vertical:absolute;mso-position-vertical-relative:page;mso-width-percent:0;mso-height-percent:0;mso-width-relative:page;mso-height-relative:page;v-text-anchor:top" o:gfxdata="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" stroked="f">
               <v:fill opacity="0"/>
               <v:path arrowok="t"/>
               <v:textbox inset=".1pt,.1pt,7.3pt,3.7pt">

</xml_diff>